<commit_message>
docs(HIT-56): record review corrections
</commit_message>
<xml_diff>
--- a/docs/labs/pr12/nb/reports/0104-pz01-nb.docx
+++ b/docs/labs/pr12/nb/reports/0104-pz01-nb.docx
@@ -1337,7 +1337,7 @@
           </w:tcPr>
           <w:p>
             <w:r>
-              <w:t>Профилирование</w:t>
+              <w:t>Покрытие</w:t>
             </w:r>
           </w:p>
         </w:tc>
@@ -1347,7 +1347,7 @@
           </w:tcPr>
           <w:p>
             <w:r>
-              <w:t>go cover</w:t>
+              <w:t>go test -coverprofile + go tool cover</w:t>
             </w:r>
           </w:p>
         </w:tc>
@@ -1357,7 +1357,7 @@
           </w:tcPr>
           <w:p>
             <w:r>
-              <w:t>coverage analysis</w:t>
+              <w:t>statement coverage and gap analysis</w:t>
             </w:r>
           </w:p>
         </w:tc>
@@ -1367,7 +1367,49 @@
           </w:tcPr>
           <w:p>
             <w:r>
-              <w:t>PASS report; gaps explicit</w:t>
+              <w:t>PASS: domain 87.7%, application 83.3%; CLI/adapters 0% unit profile</w:t>
+            </w:r>
+          </w:p>
+        </w:tc>
+      </w:tr>
+      <w:tr>
+        <w:tc>
+          <w:tcPr>
+            <w:tcW w:type="dxa" w:w="2339"/>
+          </w:tcPr>
+          <w:p>
+            <w:r>
+              <w:t>CPU/memory profiling</w:t>
+            </w:r>
+          </w:p>
+        </w:tc>
+        <w:tc>
+          <w:tcPr>
+            <w:tcW w:type="dxa" w:w="2339"/>
+          </w:tcPr>
+          <w:p>
+            <w:r>
+              <w:t>Go pprof route</w:t>
+            </w:r>
+          </w:p>
+        </w:tc>
+        <w:tc>
+          <w:tcPr>
+            <w:tcW w:type="dxa" w:w="2339"/>
+          </w:tcPr>
+          <w:p>
+            <w:r>
+              <w:t>bounded performance measurement</w:t>
+            </w:r>
+          </w:p>
+        </w:tc>
+        <w:tc>
+          <w:tcPr>
+            <w:tcW w:type="dxa" w:w="2339"/>
+          </w:tcPr>
+          <w:p>
+            <w:r>
+              <w:t>PLANNED; not executed, no performance claim</w:t>
             </w:r>
           </w:p>
         </w:tc>
@@ -2064,7 +2106,7 @@
     </w:p>
     <w:p>
       <w:r>
-        <w:t>Что открыть/выполнить: Открыть https://github.com/hitpipe/hitpipe/blob/2186a00ca9c441645c99f82fd45b34241864ac6a/services/intake/cmd/intake-contractcheck/main.go#L1-L120 либо тот же файл в редакторе на этой версии. Показать путь, существенную собственную логику конфигурации/версии/диагностики и связь с PR [PR not created; Lead human action required].</w:t>
+        <w:t>Что открыть/выполнить: Открыть https://github.com/hitpipe/hitpipe/blob/df1a7d58179148abfda8e71862654f5ef7fcdbc7/services/intake/cmd/intake-contractcheck/main.go#L1-L120 либо тот же файл в редакторе на этой версии. Показать путь, существенную собственную логику конфигурации/версии/диагностики и связь с PR [PR not created; Lead human action required].</w:t>
       </w:r>
     </w:p>
     <w:p>
@@ -2092,7 +2134,7 @@
     </w:p>
     <w:p>
       <w:r>
-        <w:t>Что открыть/выполнить: На одной версии 2186a00ca9c441645c99f82fd45b34241864ac6a выполнить python3 tools/pr12/workspace.py smoke intake --require и python3 tools/pr12/workspace.py inspect intake --mode release. Показать команды и реальные существенные настройки: оптимизации, отладочную информацию, runtime-проверки/конфигурацию, фактические результаты сборок. Если строка не различается между режимами, сохранить вывод и объяснить это в таблице.</w:t>
+        <w:t>Что открыть/выполнить: На одной версии df1a7d58179148abfda8e71862654f5ef7fcdbc7 выполнить python3 tools/pr12/workspace.py smoke intake --require и python3 tools/pr12/workspace.py inspect intake --mode release. Показать команды и реальные существенные настройки: оптимизации, отладочную информацию, runtime-проверки/конфигурацию, фактические результаты сборок. Если строка не различается между режимами, сохранить вывод и объяснить это в таблице.</w:t>
       </w:r>
     </w:p>
     <w:p>
@@ -2148,7 +2190,7 @@
     </w:p>
     <w:p>
       <w:r>
-        <w:t>Что открыть/выполнить: На версии 2186a00ca9c441645c99f82fd45b34241864ac6a выполнить python3 tools/pr12/workspace.py smoke intake --require; показать безопасное значение конфигурации, версию/SHA, диагностическую запись, ожидаемый результат и код завершения. Для долгого сервиса показать ограниченную проверку готовности и корректную остановку.</w:t>
+        <w:t>Что открыть/выполнить: На версии df1a7d58179148abfda8e71862654f5ef7fcdbc7 выполнить python3 tools/pr12/workspace.py smoke intake --require; показать безопасное значение конфигурации, версию/SHA, диагностическую запись, ожидаемый результат и код завершения. Для долгого сервиса показать ограниченную проверку готовности и корректную остановку.</w:t>
       </w:r>
     </w:p>
     <w:p>
@@ -2176,7 +2218,7 @@
     </w:p>
     <w:p>
       <w:r>
-        <w:t>Что открыть/выполнить: Выполнить NOT_APPLICABLE: bounded CLI has no runtime configuration input; do not fabricate an invalid-config run; human records this gap с безопасным тестовым неверным значением в обоих режимах. Показать понятную диагностическую ошибку, отсутствие успешного исполнения с неверной конфигурацией и фактический код завершения.</w:t>
+        <w:t>Что открыть/выполнить: Выполнить ./intake-contractcheck --fixture positive_fixture.json --format invalid (expected format_invalid, exit 2) с безопасным тестовым неверным значением в обоих режимах. Показать понятную диагностическую ошибку, отсутствие успешного исполнения с неверной конфигурацией и фактический код завершения.</w:t>
       </w:r>
     </w:p>
     <w:p>

</xml_diff>

<commit_message>
docs(pr12): refresh repeat-review package
</commit_message>
<xml_diff>
--- a/docs/labs/pr12/nb/reports/0104-pz01-nb.docx
+++ b/docs/labs/pr12/nb/reports/0104-pz01-nb.docx
@@ -1475,7 +1475,7 @@
     </w:p>
     <w:p>
       <w:r>
-        <w:t>Задача HIT-54 → ветка work/HIT-54-nb-docs → PR [not created] → local checks PASS → review/merge pending. Main code candidate is linked by exact SHA, not declared merged.</w:t>
+        <w:t>Задача HIT-54 → ветка work/HIT-54-nb-docs → PR https://github.com/hitpipe/hitpipe/pull/39 → native/local checks recorded → review/merge pending. Main code candidate is linked by exact SHA, not declared merged.</w:t>
       </w:r>
     </w:p>
     <w:p>
@@ -1488,7 +1488,7 @@
     </w:p>
     <w:p>
       <w:r>
-        <w:t>Схема: Go source → module preparation → gofmt/compile/HMAC transformation → intake-contractcheck binary → fixture diagnostic outside checkout.</w:t>
+        <w:t>Схема: Go source → module preparation → gofmt/compile/HMAC transformation → intake-contractcheck binary → fresh outside-checkout distribution.</w:t>
       </w:r>
     </w:p>
     <w:p>
@@ -1559,7 +1559,7 @@
           </w:tcPr>
           <w:p>
             <w:r>
-              <w:t>NOT RUN / PASS; docs/labs/pr12/nb/evidence/hit-54-d1-clean.log</w:t>
+              <w:t>workspace.py smoke intake --require; dev binary outside-checkout; diagnostic_smoke PASS (hit-54-d1-clean.log)</w:t>
             </w:r>
           </w:p>
         </w:tc>
@@ -1569,7 +1569,7 @@
           </w:tcPr>
           <w:p>
             <w:r>
-              <w:t>NOT RUN / PASS; docs/labs/pr12/nb/evidence/hit-54-d1-clean.log</w:t>
+              <w:t>workspace.py inspect intake --mode release; release binary outside-checkout; diagnostic_smoke PASS (hit-54-d1-clean.log)</w:t>
             </w:r>
           </w:p>
         </w:tc>
@@ -1591,7 +1591,7 @@
           </w:tcPr>
           <w:p>
             <w:r>
-              <w:t>NOT RUN / PASS; docs/labs/pr12/nb/evidence/hit-54-d1-clean.log</w:t>
+              <w:t>go build with -gcflags=all=-N -l; Go 1.27.2; vcs.modified=false</w:t>
             </w:r>
           </w:p>
         </w:tc>
@@ -1601,7 +1601,7 @@
           </w:tcPr>
           <w:p>
             <w:r>
-              <w:t>NOT RUN / PASS; docs/labs/pr12/nb/evidence/hit-54-d1-clean.log</w:t>
+              <w:t>go build -trimpath; Go 1.27.2; vcs.modified=false and release metadata inspected</w:t>
             </w:r>
           </w:p>
         </w:tc>
@@ -1623,7 +1623,7 @@
           </w:tcPr>
           <w:p>
             <w:r>
-              <w:t>NOT RUN / PASS; docs/labs/pr12/nb/evidence/hit-54-d1-clean.log</w:t>
+              <w:t>No optimization measurement; debug build is intentionally diagnostic</w:t>
             </w:r>
           </w:p>
         </w:tc>
@@ -1633,7 +1633,7 @@
           </w:tcPr>
           <w:p>
             <w:r>
-              <w:t>NOT RUN / PASS; docs/labs/pr12/nb/evidence/hit-54-d1-clean.log</w:t>
+              <w:t>-trimpath only; no performance measurement or claim; pprof PLANNED</w:t>
             </w:r>
           </w:p>
         </w:tc>
@@ -1655,7 +1655,7 @@
           </w:tcPr>
           <w:p>
             <w:r>
-              <w:t>NOT RUN / PASS; docs/labs/pr12/nb/evidence/hit-54-d1-clean.log</w:t>
+              <w:t>--version and JSON fixture output show component/mode/PASS/synthetic scope</w:t>
             </w:r>
           </w:p>
         </w:tc>
@@ -1665,7 +1665,7 @@
           </w:tcPr>
           <w:p>
             <w:r>
-              <w:t>NOT RUN / PASS; docs/labs/pr12/nb/evidence/hit-54-d1-clean.log</w:t>
+              <w:t>--version and JSON fixture output show release mode/PASS/synthetic scope; no secret/body/header</w:t>
             </w:r>
           </w:p>
         </w:tc>
@@ -1687,7 +1687,7 @@
           </w:tcPr>
           <w:p>
             <w:r>
-              <w:t>NOT RUN / PASS; docs/labs/pr12/nb/evidence/hit-54-d1-clean.log</w:t>
+              <w:t>verified fixture accepted; tampered fixture rejected by contractcheck</w:t>
             </w:r>
           </w:p>
         </w:tc>
@@ -1697,7 +1697,7 @@
           </w:tcPr>
           <w:p>
             <w:r>
-              <w:t>NOT RUN / PASS; docs/labs/pr12/nb/evidence/hit-54-d1-clean.log</w:t>
+              <w:t>verified fixture accepted; tampered fixture rejected by release binary; valid route exit 0</w:t>
             </w:r>
           </w:p>
         </w:tc>
@@ -1719,7 +1719,7 @@
           </w:tcPr>
           <w:p>
             <w:r>
-              <w:t>NOT RUN / PASS; docs/labs/pr12/nb/evidence/hit-54-d1-clean.log</w:t>
+              <w:t>.pr12-build/intake/dev/intake-contractcheck plus outside distribution and verified fixture</w:t>
             </w:r>
           </w:p>
         </w:tc>
@@ -1729,7 +1729,7 @@
           </w:tcPr>
           <w:p>
             <w:r>
-              <w:t>NOT RUN / PASS; docs/labs/pr12/nb/evidence/hit-54-d1-clean.log</w:t>
+              <w:t>.pr12-build/intake/release/intake-contractcheck plus freshly copied outside distribution and verified fixture</w:t>
             </w:r>
           </w:p>
         </w:tc>
@@ -1737,7 +1737,7 @@
     </w:tbl>
     <w:p>
       <w:r>
-        <w:t>Один verified positive and tampered fixture in dev/release. Both safe smoke observations PASS; release inspection records vcs.modified=false. No performance claim.</w:t>
+        <w:t>One verified positive and one tampered fixture were observed in dev/release. Release inspection records vcs.modified=false. No CPU/memory performance claim.</w:t>
       </w:r>
     </w:p>
     <w:p>
@@ -1817,7 +1817,7 @@
           </w:tcPr>
           <w:p>
             <w:r>
-              <w:t>Допустимая конфигурация влияет на поведение</w:t>
+              <w:t>PASS</w:t>
             </w:r>
           </w:p>
         </w:tc>
@@ -1827,7 +1827,7 @@
           </w:tcPr>
           <w:p>
             <w:r>
-              <w:t>safe bounded outcome; no secret/body/header</w:t>
+              <w:t>verified fixture produces safe diagnostic</w:t>
             </w:r>
           </w:p>
         </w:tc>
@@ -1837,7 +1837,7 @@
           </w:tcPr>
           <w:p>
             <w:r>
-              <w:t>PASS local</w:t>
+              <w:t>PASS; dev/release smoke exit 0</w:t>
             </w:r>
           </w:p>
         </w:tc>
@@ -1847,7 +1847,7 @@
           </w:tcPr>
           <w:p>
             <w:r>
-              <w:t>hit-54-d1-clean.log; SHA 27210ca</w:t>
+              <w:t>python3 tools/pr12/workspace.py smoke intake --require; Go 1.27.2; hit-54-d1-clean.log</w:t>
             </w:r>
           </w:p>
         </w:tc>
@@ -1859,7 +1859,7 @@
           </w:tcPr>
           <w:p>
             <w:r>
-              <w:t>Неверная конфигурация даёт понятную ошибку</w:t>
+              <w:t>format_invalid</w:t>
             </w:r>
           </w:p>
         </w:tc>
@@ -1869,7 +1869,7 @@
           </w:tcPr>
           <w:p>
             <w:r>
-              <w:t>safe bounded outcome; no secret/body/header</w:t>
+              <w:t>invalid format is rejected without secret data</w:t>
             </w:r>
           </w:p>
         </w:tc>
@@ -1879,7 +1879,7 @@
           </w:tcPr>
           <w:p>
             <w:r>
-              <w:t>PASS local; tampered rejected</w:t>
+              <w:t>PASS; invalid format route is exit 2</w:t>
             </w:r>
           </w:p>
         </w:tc>
@@ -1889,7 +1889,7 @@
           </w:tcPr>
           <w:p>
             <w:r>
-              <w:t>hit-54-d1-clean.log; SHA 27210ca</w:t>
+              <w:t>./intake-contractcheck --fixture verified.json --format invalid; expected exit recorded separately</w:t>
             </w:r>
           </w:p>
         </w:tc>
@@ -1901,7 +1901,7 @@
           </w:tcPr>
           <w:p>
             <w:r>
-              <w:t>Версия однозначно указывает исходный код</w:t>
+              <w:t>version</w:t>
             </w:r>
           </w:p>
         </w:tc>
@@ -1911,7 +1911,7 @@
           </w:tcPr>
           <w:p>
             <w:r>
-              <w:t>safe bounded outcome; no secret/body/header</w:t>
+              <w:t>binary identifies source/build mode</w:t>
             </w:r>
           </w:p>
         </w:tc>
@@ -1921,7 +1921,7 @@
           </w:tcPr>
           <w:p>
             <w:r>
-              <w:t>PASS local</w:t>
+              <w:t>PASS; go version -m shows go1.27.2, vcs.revision, vcs.modified=false</w:t>
             </w:r>
           </w:p>
         </w:tc>
@@ -1931,7 +1931,7 @@
           </w:tcPr>
           <w:p>
             <w:r>
-              <w:t>hit-54-d1-clean.log; SHA 27210ca</w:t>
+              <w:t>go version -m .pr12-build/intake/release/intake-contractcheck; hit-54-d1-clean.log</w:t>
             </w:r>
           </w:p>
         </w:tc>
@@ -1943,7 +1943,7 @@
           </w:tcPr>
           <w:p>
             <w:r>
-              <w:t>Диагностика запуска и результата без секретов</w:t>
+              <w:t>safe output</w:t>
             </w:r>
           </w:p>
         </w:tc>
@@ -1953,7 +1953,7 @@
           </w:tcPr>
           <w:p>
             <w:r>
-              <w:t>safe bounded outcome; no secret/body/header</w:t>
+              <w:t>no secret/body/header logging</w:t>
             </w:r>
           </w:p>
         </w:tc>
@@ -1963,7 +1963,7 @@
           </w:tcPr>
           <w:p>
             <w:r>
-              <w:t>PASS local</w:t>
+              <w:t>PASS; output is bounded JSON/text diagnostic</w:t>
             </w:r>
           </w:p>
         </w:tc>
@@ -1973,7 +1973,7 @@
           </w:tcPr>
           <w:p>
             <w:r>
-              <w:t>hit-54-d1-clean.log; SHA 27210ca</w:t>
+              <w:t>hit-54-d1-clean.log; synthetic fixtures only</w:t>
             </w:r>
           </w:p>
         </w:tc>
@@ -1985,7 +1985,7 @@
           </w:tcPr>
           <w:p>
             <w:r>
-              <w:t>Остановка, повторный запуск, восстановление исходного состояния</w:t>
+              <w:t>restoration</w:t>
             </w:r>
           </w:p>
         </w:tc>
@@ -1995,7 +1995,7 @@
           </w:tcPr>
           <w:p>
             <w:r>
-              <w:t>safe bounded outcome; no secret/body/header</w:t>
+              <w:t>clean source and repeatable build</w:t>
             </w:r>
           </w:p>
         </w:tc>
@@ -2005,7 +2005,7 @@
           </w:tcPr>
           <w:p>
             <w:r>
-              <w:t>PASS local</w:t>
+              <w:t>PASS in native recorded run; current branch remains reviewable</w:t>
             </w:r>
           </w:p>
         </w:tc>
@@ -2015,7 +2015,7 @@
           </w:tcPr>
           <w:p>
             <w:r>
-              <w:t>hit-54-d1-clean.log; SHA 27210ca</w:t>
+              <w:t>PR #39; run 39262425665; human merge remains pending</w:t>
             </w:r>
           </w:p>
         </w:tc>
@@ -2023,7 +2023,7 @@
     </w:tbl>
     <w:p>
       <w:r>
-        <w:t>Versions: Go go1.27.2, Python 3.12, Git 2.x; safe synthetic fixture only. See docs/labs/pr12/nb/evidence/hit-54-d1-clean.log.</w:t>
+        <w:t>Versions: native CI Go go1.27.2; Python 3.12 wrapper; Git. Synthetic fixture only. Evidence: docs/labs/pr12/nb/evidence/hit-54-d1-clean.log; source snapshot a74a5e1a8ada1147b5755503fd01fd458b8a4706.</w:t>
       </w:r>
     </w:p>
     <w:p>
@@ -2049,7 +2049,7 @@
     </w:p>
     <w:p>
       <w:r>
-        <w:t>CI workflow path exists; C3 run 39262304491 is success. HIT-54 branch run was in progress at report build; human screenshot/review/merge pending.</w:t>
+        <w:t>PR #39 is published; historical native run 39262425665 is success and current-head checks are linked from the package index. Human screenshot/review/merge pending.</w:t>
       </w:r>
     </w:p>
     <w:p>
@@ -2106,7 +2106,7 @@
     </w:p>
     <w:p>
       <w:r>
-        <w:t>Что открыть/выполнить: Открыть https://github.com/hitpipe/hitpipe/blob/df1a7d58179148abfda8e71862654f5ef7fcdbc7/services/intake/cmd/intake-contractcheck/main.go#L1-L120 либо тот же файл в редакторе на этой версии. Показать путь, существенную собственную логику конфигурации/версии/диагностики и связь с PR [PR not created; Lead human action required].</w:t>
+        <w:t>Что открыть/выполнить: Открыть https://github.com/hitpipe/hitpipe/blob/d164aebd5b746151da41717f0ffb483eb9b39a63/services/intake/cmd/intake-contractcheck/main.go#L1-L120 либо тот же файл в редакторе на этой версии. Показать путь, существенную собственную логику конфигурации/версии/диагностики и связь с PR https://github.com/hitpipe/hitpipe/pull/39.</w:t>
       </w:r>
     </w:p>
     <w:p>
@@ -2134,7 +2134,7 @@
     </w:p>
     <w:p>
       <w:r>
-        <w:t>Что открыть/выполнить: На одной версии df1a7d58179148abfda8e71862654f5ef7fcdbc7 выполнить python3 tools/pr12/workspace.py smoke intake --require и python3 tools/pr12/workspace.py inspect intake --mode release. Показать команды и реальные существенные настройки: оптимизации, отладочную информацию, runtime-проверки/конфигурацию, фактические результаты сборок. Если строка не различается между режимами, сохранить вывод и объяснить это в таблице.</w:t>
+        <w:t>Что открыть/выполнить: На одной версии d164aebd5b746151da41717f0ffb483eb9b39a63 выполнить python3 tools/pr12/workspace.py smoke intake --require и python3 tools/pr12/workspace.py inspect intake --mode release. Показать команды и реальные существенные настройки: оптимизации, отладочную информацию, runtime-проверки/конфигурацию, фактические результаты сборок. Если строка не различается между режимами, сохранить вывод и объяснить это в таблице.</w:t>
       </w:r>
     </w:p>
     <w:p>
@@ -2190,7 +2190,7 @@
     </w:p>
     <w:p>
       <w:r>
-        <w:t>Что открыть/выполнить: На версии df1a7d58179148abfda8e71862654f5ef7fcdbc7 выполнить python3 tools/pr12/workspace.py smoke intake --require; показать безопасное значение конфигурации, версию/SHA, диагностическую запись, ожидаемый результат и код завершения. Для долгого сервиса показать ограниченную проверку готовности и корректную остановку.</w:t>
+        <w:t>Что открыть/выполнить: На версии d164aebd5b746151da41717f0ffb483eb9b39a63 выполнить python3 tools/pr12/workspace.py smoke intake --require; показать безопасное значение конфигурации, версию/SHA, диагностическую запись, ожидаемый результат и код завершения. Для долгого сервиса показать ограниченную проверку готовности и корректную остановку.</w:t>
       </w:r>
     </w:p>
     <w:p>
@@ -2218,7 +2218,7 @@
     </w:p>
     <w:p>
       <w:r>
-        <w:t>Что открыть/выполнить: Выполнить ./intake-contractcheck --fixture positive_fixture.json --format invalid (expected format_invalid, exit 2) с безопасным тестовым неверным значением в обоих режимах. Показать понятную диагностическую ошибку, отсутствие успешного исполнения с неверной конфигурацией и фактический код завершения.</w:t>
+        <w:t>Что открыть/выполнить: Выполнить ./intake-contractcheck --fixture verified.json --format invalid с безопасным тестовым неверным значением в обоих режимах. Показать понятную диагностическую ошибку, отсутствие успешного исполнения с неверной конфигурацией и фактический код завершения.</w:t>
       </w:r>
     </w:p>
     <w:p>
@@ -2274,7 +2274,7 @@
     </w:p>
     <w:p>
       <w:r>
-        <w:t>Что открыть/выполнить: В изолированной временной ветке нарушить условие add controlled failing test that violates the expected wrapper condition, затем выполнить PR12_RACE=1 python3 tools/pr12/workspace.py check intake. Показать смысловое нарушение, точную команду той же проверки, реально неуспешный результат и код завершения. После фиксации журнала восстановить исправный код; ссылка на обычный CI прогон — https://github.com/hitpipe/hitpipe/actions/runs/39262425665 (status pending at report build).</w:t>
+        <w:t>Что открыть/выполнить: В изолированной временной ветке нарушить условие add controlled failing test that violates the expected wrapper condition, затем выполнить PR12_RACE=1 python3 tools/pr12/workspace.py check intake. Показать смысловое нарушение, точную команду той же проверки, реально неуспешный результат и код завершения. После фиксации журнала восстановить исправный код; ссылка на обычный CI прогон — https://github.com/hitpipe/hitpipe/pull/39; historical native run 39262425665 success.</w:t>
       </w:r>
     </w:p>
     <w:p>

</xml_diff>